<commit_message>
Invoice rep, instant board relink, agreement PDF, aligned menu
- Invoices print the person who generated them as Sales Representative
  (Sales Directory 姓名 + new 邮箱 column) instead of a hard-coded name;
  a missing email only prints the name and says so on the result card.
- A missing address no longer triggers a warning; only a missing payout
  account blocks an invoice.
- Registering a client in the bot links that client's earlier board rows
  right away (filtered by UID) instead of waiting for the next import.
- Agreements are sent as Word + PDF through the same Word folder the
  invoices use; the PDF step now lives in documents/pdf.py.
- Agreement and invoice both say "正在生成" before the slow part.
- Menu items are interactive containers with a left-aligned emoji and
  label, so every entry lines up.

Co-Authored-By: Claude Opus 5.5 <noreply@anthropic.com>
Claude-Session: https://claude.ai/code/session_011Ls99Jsycm36RZnrpVZ6vt
</commit_message>
<xml_diff>
--- a/src/crm_basebot/documents/templates/invoice-bank.docx
+++ b/src/crm_basebot/documents/templates/invoice-bank.docx
@@ -1176,25 +1176,9 @@
                                   </w:pPr>
                                   <w:r>
                                     <w:rPr>
-                                      <w:w w:val="85"/>
-                                      <w:sz w:val="17"/>
-                                    </w:rPr>
-                                    <w:t>James</w:t>
-                                  </w:r>
-                                  <w:r>
-                                    <w:rPr>
-                                      <w:spacing w:val="2"/>
-                                      <w:sz w:val="17"/>
-                                    </w:rPr>
-                                    <w:t> </w:t>
-                                  </w:r>
-                                  <w:r>
-                                    <w:rPr>
-                                      <w:spacing w:val="-4"/>
-                                      <w:w w:val="95"/>
-                                      <w:sz w:val="17"/>
-                                    </w:rPr>
-                                    <w:t>Yang</w:t>
+                                      <w:sz w:val="17"/>
+                                    </w:rPr>
+                                    <w:t>{{ sales_name }}</w:t>
                                   </w:r>
                                 </w:p>
                               </w:tc>
@@ -1215,17 +1199,15 @@
                                       <w:sz w:val="17"/>
                                     </w:rPr>
                                   </w:pPr>
-                                  <w:hyperlink r:id="rId6">
-                                    <w:r>
-                                      <w:rPr>
-                                        <w:color w:val="0462C1"/>
-                                        <w:spacing w:val="-5"/>
-                                        <w:sz w:val="17"/>
-                                        <w:u w:val="single" w:color="0462C1"/>
-                                      </w:rPr>
-                                      <w:t>james.yang@hashkey.com</w:t>
-                                    </w:r>
-                                  </w:hyperlink>
+                                  <w:r>
+                                    <w:rPr>
+                                      <w:color w:val="0462C1"/>
+                                      <w:spacing w:val="-5"/>
+                                      <w:sz w:val="17"/>
+                                      <w:u w:val="single" w:color="0462C1"/>
+                                    </w:rPr>
+                                    <w:t>{{ sales_email }}</w:t>
+                                  </w:r>
                                 </w:p>
                               </w:tc>
                             </w:tr>
@@ -1338,25 +1320,9 @@
                             </w:pPr>
                             <w:r>
                               <w:rPr>
-                                <w:w w:val="85"/>
-                                <w:sz w:val="17"/>
-                              </w:rPr>
-                              <w:t>James</w:t>
-                            </w:r>
-                            <w:r>
-                              <w:rPr>
-                                <w:spacing w:val="2"/>
-                                <w:sz w:val="17"/>
-                              </w:rPr>
-                              <w:t> </w:t>
-                            </w:r>
-                            <w:r>
-                              <w:rPr>
-                                <w:spacing w:val="-4"/>
-                                <w:w w:val="95"/>
-                                <w:sz w:val="17"/>
-                              </w:rPr>
-                              <w:t>Yang</w:t>
+                                <w:sz w:val="17"/>
+                              </w:rPr>
+                              <w:t>{{ sales_name }}</w:t>
                             </w:r>
                           </w:p>
                         </w:tc>
@@ -1377,17 +1343,15 @@
                                 <w:sz w:val="17"/>
                               </w:rPr>
                             </w:pPr>
-                            <w:hyperlink r:id="rId6">
-                              <w:r>
-                                <w:rPr>
-                                  <w:color w:val="0462C1"/>
-                                  <w:spacing w:val="-5"/>
-                                  <w:sz w:val="17"/>
-                                  <w:u w:val="single" w:color="0462C1"/>
-                                </w:rPr>
-                                <w:t>james.yang@hashkey.com</w:t>
-                              </w:r>
-                            </w:hyperlink>
+                            <w:r>
+                              <w:rPr>
+                                <w:color w:val="0462C1"/>
+                                <w:spacing w:val="-5"/>
+                                <w:sz w:val="17"/>
+                                <w:u w:val="single" w:color="0462C1"/>
+                              </w:rPr>
+                              <w:t>{{ sales_email }}</w:t>
+                            </w:r>
                           </w:p>
                         </w:tc>
                       </w:tr>

</xml_diff>